<commit_message>
Don't block first login behind a password change; nag with a banner instead
Client feedback: too many steps for a new user. Accounts on an Admin-issued temporary password now go straight into the app.

- (app) layout no longer redirects to /change-password; it renders TempPasswordBanner on every page (orange, non-dismissable, shows the temp-password expiry date) until mustChangePassword clears
- createUser / resetUserPassword also drop a PASSWORD_TEMP notification linking to /change-password
- /change-password in temp mode gets a "ไว้ทีหลัง" link; after a successful change the action returns a one-shot "password" login ticket and the form silently re-signs-in (tokenVersion bump no longer forces a fresh login); ticket provider skips the login audit/markLoggedIn for that purpose
- First-use manual (docs/), README and CHANGELOG updated to the new flow

Co-Authored-By: Claude Fable 5.1 <noreply@anthropic.com>
Claude-Session: https://claude.ai/code/session_01B4tUGXJdYaRWkiYFyT1Bzk
</commit_message>
<xml_diff>
--- a/docs/TeachSchedule-คู่มือการใช้งานครั้งแรก.docx
+++ b/docs/TeachSchedule-คู่มือการใช้งานครั้งแรก.docx
@@ -1557,7 +1557,7 @@
                 <w:sz w:val="22"/>
                 <w:szCs w:val="22"/>
               </w:rPr>
-              <w:t xml:space="preserve"> หลังจากนั้นต้องให้ผู้ดูแลระบบรีเซ็ตใหม่ หรือใช้ QR ผูกเครื่องแทน — ล็อกอินครั้งแรกระบบจะบังคับตั้งรหัสผ่านใหม่ทันที</w:t>
+              <w:t xml:space="preserve"> หลังจากนั้นต้องให้ผู้ดูแลระบบรีเซ็ตใหม่ หรือใช้ QR ผูกเครื่องแทน — หลังล็อกอินจะมีแถบเตือนสีส้มให้ตั้งรหัสผ่านของตัวเองจนกว่าจะเปลี่ยน</w:t>
             </w:r>
           </w:p>
         </w:tc>
@@ -1666,7 +1666,7 @@
           <w:sz w:val="22"/>
           <w:szCs w:val="22"/>
         </w:rPr>
-        <w:t xml:space="preserve">ถ้าเป็นรหัสผ่านชั่วคราว ระบบจะพาไปหน้า “ตั้งรหัสผ่านใหม่” ก่อน — ตั้งรหัสอย่างน้อย 8 ตัวอักษร ยิ่งยาวยิ่งดี ห้ามใช้รหัสยอดนิยมหรือมีชื่อผู้ใช้/อีเมลของตัวเอง</w:t>
+        <w:t xml:space="preserve">ถ้าเป็นรหัสผ่านชั่วคราว จะเข้าใช้งานได้เลย แต่มีแถบเตือนสีส้มด้านบนทุกหน้า + การแจ้งเตือน ให้กด “ตั้งรหัสผ่านใหม่” — ตั้งรหัสอย่างน้อย 8 ตัวอักษร ยิ่งยาวยิ่งดี ห้ามใช้รหัสยอดนิยมหรือมีชื่อผู้ใช้/อีเมลของตัวเอง ทำให้เสร็จก่อนรหัสชั่วคราวหมดอายุ</w:t>
       </w:r>
     </w:p>
     <w:p>
@@ -2380,7 +2380,7 @@
                 <w:sz w:val="20"/>
                 <w:szCs w:val="20"/>
               </w:rPr>
-              <w:t xml:space="preserve">แจ้งรหัสชั่วคราวให้เจ้าตัวโดยตรง → ล็อกอินครั้งแรกระบบบังคับตั้งรหัสใหม่ → อาจารย์ลงทะเบียนอุปกรณ์เองที่หน้าเช็คอิน → แอดมินอนุมัติ</w:t>
+              <w:t xml:space="preserve">แจ้งรหัสชั่วคราวให้เจ้าตัวโดยตรง → อาจารย์ล็อกอินแล้วตั้งรหัสใหม่ตามแถบเตือน → ลงทะเบียนอุปกรณ์เองที่หน้าเช็คอิน → แอดมินอนุมัติ</w:t>
             </w:r>
           </w:p>
         </w:tc>
@@ -3821,7 +3821,7 @@
           <w:sz w:val="22"/>
           <w:szCs w:val="22"/>
         </w:rPr>
-        <w:t xml:space="preserve">ระบบบังคับตั้งรหัสผ่านใหม่ทันที: อย่างน้อย 8 ตัวอักษร มีแถบวัดความแข็งแรง ห้ามใช้รหัสยอดนิยม (เช่น 12345678) หรือมีชื่อผู้ใช้/อีเมลของตัวเอง</w:t>
+        <w:t xml:space="preserve">เข้าใช้งานได้ทันที แต่จะเห็นแถบเตือนสีส้ม “คุณกำลังใช้รหัสผ่านชั่วคราว” ทุกหน้า — กด “ตั้งรหัสผ่านใหม่” แล้วตั้งรหัสอย่างน้อย 8 ตัวอักษร (มีแถบวัดความแข็งแรง ห้ามใช้รหัสยอดนิยม เช่น 12345678 หรือมีชื่อผู้ใช้/อีเมลของตัวเอง) เสร็จแล้วใช้งานต่อได้เลยไม่ต้องล็อกอินใหม่</w:t>
       </w:r>
     </w:p>
     <w:p>
@@ -4439,7 +4439,7 @@
           <w:sz w:val="22"/>
           <w:szCs w:val="22"/>
         </w:rPr>
-        <w:t xml:space="preserve"> — ติดต่อผู้ดูแลระบบให้กด “รีเซ็ตรหัสผ่าน” จะได้รหัสชั่วคราวใหม่ (ใช้ได้ 7 วัน) แล้วระบบบังคับตั้งรหัสใหม่ตอนล็อกอิน — ไม่มีการรีเซ็ตด้วยตัวเองผ่านอีเมล</w:t>
+        <w:t xml:space="preserve"> — ติดต่อผู้ดูแลระบบให้กด “รีเซ็ตรหัสผ่าน” จะได้รหัสชั่วคราวใหม่ (ใช้ได้ 7 วัน) แล้วตั้งรหัสใหม่ตามแถบเตือนหลังล็อกอิน — ไม่มีการรีเซ็ตด้วยตัวเองผ่านอีเมล</w:t>
       </w:r>
     </w:p>
     <w:p>

</xml_diff>